<commit_message>
fix(lecons): les trois leçons n°01 sans adresse — liens sans cible réparés, sources primaires ajoutées
Leurs ressources étaient des hyperliens dont la relation ne portait aucun Target (bug du
script de la première semaine). Cibles posées d'après les libellés, testées ; Manuel
d'Épictète ch. 1 et Stanford Encyclopedia (stoïcisme), Enneagram Institute Type Two
(ennéagramme), série Dzogchen de Lotsawa House (dzogchen) ajoutés. Deux citations sans
source reformulées. Contrôle complet à exit 0 sur les trois.

Co-Authored-By: Claude Opus 5 <noreply@anthropic.com>
</commit_message>
<xml_diff>
--- a/livrables/lecons/2026-06-05_lecon-dzogchen_01_rigpa-reconnaissance.docx
+++ b/livrables/lecons/2026-06-05_lecon-dzogchen_01_rigpa-reconnaissance.docx
@@ -338,6 +338,24 @@
       <w:pPr>
         <w:spacing w:after="100" w:before="100"/>
       </w:pPr>
+      <w:hyperlink w:history="1" r:id="rIdlhdz2026">
+        <w:r>
+          <w:rPr>
+            <w:b/>
+            <w:bCs/>
+            <w:color w:val="1155CC"/>
+            <w:sz w:val="44"/>
+            <w:szCs w:val="44"/>
+            <w:u w:val="single"/>
+          </w:rPr>
+          <w:t xml:space="preserve">Lotsawa House : série Dzogchen (textes classiques traduits) — ajoutée le 13/09/2026</w:t>
+        </w:r>
+      </w:hyperlink>
+    </w:p>
+    <w:p>
+      <w:pPr>
+        <w:spacing w:after="100" w:before="100"/>
+      </w:pPr>
       <w:hyperlink w:history="1" r:id="rId2ybj3afvsuohwvmqc6lqt">
         <w:r>
           <w:rPr>
@@ -348,7 +366,7 @@
             <w:szCs w:val="44"/>
             <w:u w:val="single"/>
           </w:rPr>
-          <w:t xml:space="preserve">Lotsawa House : The Swift Primordial Path (Ngondro)</w:t>
+          <w:t xml:space="preserve">Lotsawa House : Swift Primordial Path Ngöndro (Dilgo Khyentse Rinpoché)</w:t>
         </w:r>
       </w:hyperlink>
     </w:p>
@@ -366,7 +384,7 @@
             <w:szCs w:val="44"/>
             <w:u w:val="single"/>
           </w:rPr>
-          <w:t xml:space="preserve">Lotsawa House : Khandro Nyingtik Ngondro</w:t>
+          <w:t xml:space="preserve">Lotsawa House : série Khandro Nyingtik (préliminaires et prières de lignée)</w:t>
         </w:r>
       </w:hyperlink>
     </w:p>
@@ -384,7 +402,7 @@
             <w:szCs w:val="44"/>
             <w:u w:val="single"/>
           </w:rPr>
-          <w:t xml:space="preserve">Rigpa (Sogyal Rinpoche) : Dzogchen Resources</w:t>
+          <w:t xml:space="preserve">Rigpa (organisation fondée par Sogyal Rinpoché) : site officiel — page d'accueil, 8 059 caractères, pas de ressource Dzogchen dédiée trouvée</w:t>
         </w:r>
       </w:hyperlink>
     </w:p>
@@ -485,6 +503,19 @@
       </w:pPr>
       <w:r>
         <w:t xml:space="preserve">Généré : 05/06/2026 • Leçon 01/rigpa-reconnaissance</w:t>
+      </w:r>
+    </w:p>
+    <w:p>
+      <w:pPr>
+        <w:spacing w:after="80"/>
+      </w:pPr>
+      <w:r>
+        <w:rPr>
+          <w:color w:val="1F2937"/>
+          <w:sz w:val="22"/>
+          <w:szCs w:val="22"/>
+        </w:rPr>
+        <w:t xml:space="preserve">② Les quatre ressources étaient des liens sans cible — 13/09/2026. Les libellés « Wikipedia : Dzogchen », « Lotsawa House : … », « Rigpa … » étaient bien des hyperliens dans le document, mais leurs relations ne portaient AUCUNE adresse (bug du script de génération du 05/06/2026, premier jour du parcours) : le lecteur cliquait dans le vide. Cibles posées le 13/09/2026 et testées à 200 : la page Wikipédia (59 947 caractères, qui porte rigpa / ma rigpa, trekchö, tögal, les trois séries et base-chemin-fruit — tout ce que la théorie énonce), le Swift Primordial Path Ngöndro de Dilgo Khyentse Rinpoché et la série Khandro Nyingtik sur Lotsawa House, le site de Rigpa (page d'accueil, dont le libellé ne promet plus des « Dzogchen Resources » qu'elle ne porte pas). Une cinquième ressource, la série Dzogchen de Lotsawa House, est ajoutée. La citation retirée le 11/09 n'a pas retrouvé de source : elle reste une reformulation.</w:t>
       </w:r>
     </w:p>
     <w:sectPr>

</xml_diff>